<commit_message>
draft and responces files were humanized
</commit_message>
<xml_diff>
--- a/responces4Reveiwer2comments.docx
+++ b/responces4Reveiwer2comments.docx
@@ -115,142 +115,60 @@
                 <w:szCs w:val="24"/>
               </w:rPr>
             </w:pPr>
-            <w:proofErr w:type="spellStart"/>
-            <w:r>
-              <w:rPr>
-                <w:rFonts w:asciiTheme="majorBidi" w:eastAsia="Times New Roman" w:hAnsiTheme="majorBidi" w:cstheme="majorBidi"/>
-                <w:color w:val="FF0000"/>
-                <w:sz w:val="24"/>
-                <w:szCs w:val="24"/>
-              </w:rPr>
-              <w:t>Darvishi</w:t>
-            </w:r>
-            <w:proofErr w:type="spellEnd"/>
-            <w:r>
-              <w:rPr>
-                <w:rFonts w:asciiTheme="majorBidi" w:eastAsia="Times New Roman" w:hAnsiTheme="majorBidi" w:cstheme="majorBidi"/>
-                <w:color w:val="FF0000"/>
-                <w:sz w:val="24"/>
-                <w:szCs w:val="24"/>
-              </w:rPr>
-              <w:t xml:space="preserve"> </w:t>
-            </w:r>
-            <w:proofErr w:type="spellStart"/>
-            <w:r>
-              <w:rPr>
-                <w:rFonts w:asciiTheme="majorBidi" w:eastAsia="Times New Roman" w:hAnsiTheme="majorBidi" w:cstheme="majorBidi"/>
-                <w:color w:val="FF0000"/>
-                <w:sz w:val="24"/>
-                <w:szCs w:val="24"/>
-              </w:rPr>
-              <w:t>Boloorani</w:t>
-            </w:r>
-            <w:proofErr w:type="spellEnd"/>
-            <w:r>
-              <w:rPr>
-                <w:rFonts w:asciiTheme="majorBidi" w:eastAsia="Times New Roman" w:hAnsiTheme="majorBidi" w:cstheme="majorBidi"/>
-                <w:color w:val="FF0000"/>
-                <w:sz w:val="24"/>
-                <w:szCs w:val="24"/>
-              </w:rPr>
-              <w:t xml:space="preserve"> et al., 2023a </w:t>
-            </w:r>
-            <w:proofErr w:type="gramStart"/>
-            <w:r>
-              <w:rPr>
-                <w:rFonts w:asciiTheme="majorBidi" w:eastAsia="Times New Roman" w:hAnsiTheme="majorBidi" w:cstheme="majorBidi"/>
-                <w:color w:val="FF0000"/>
-                <w:sz w:val="24"/>
-                <w:szCs w:val="24"/>
-              </w:rPr>
-              <w:t>The</w:t>
-            </w:r>
-            <w:proofErr w:type="gramEnd"/>
-            <w:r>
-              <w:rPr>
-                <w:rFonts w:asciiTheme="majorBidi" w:eastAsia="Times New Roman" w:hAnsiTheme="majorBidi" w:cstheme="majorBidi"/>
-                <w:color w:val="FF0000"/>
-                <w:sz w:val="24"/>
-                <w:szCs w:val="24"/>
-              </w:rPr>
-              <w:t xml:space="preserve"> order of the references needs to be corrected. For example, reference 2023a should be mentioned before reference 2023c to maintain proper numerical/alphabetical sequencing.</w:t>
-            </w:r>
-          </w:p>
-          <w:p>
-            <w:pPr>
-              <w:jc w:val="center"/>
-              <w:rPr>
-                <w:rFonts w:asciiTheme="majorBidi" w:hAnsiTheme="majorBidi" w:cstheme="majorBidi"/>
-                <w:color w:val="FF0000"/>
-                <w:sz w:val="24"/>
-                <w:szCs w:val="24"/>
-              </w:rPr>
-            </w:pPr>
-          </w:p>
-        </w:tc>
-        <w:tc>
-          <w:tcPr>
-            <w:tcW w:w="4675" w:type="dxa"/>
-            <w:vAlign w:val="center"/>
-          </w:tcPr>
-          <w:p>
-            <w:pPr>
-              <w:jc w:val="center"/>
-              <w:rPr>
-                <w:rFonts w:asciiTheme="majorBidi" w:hAnsiTheme="majorBidi" w:cstheme="majorBidi"/>
-                <w:color w:val="0070C0"/>
-                <w:sz w:val="24"/>
-                <w:szCs w:val="24"/>
-              </w:rPr>
-            </w:pPr>
-            <w:r>
-              <w:rPr>
-                <w:rFonts w:asciiTheme="majorBidi" w:hAnsiTheme="majorBidi" w:cstheme="majorBidi"/>
-                <w:color w:val="0070C0"/>
-                <w:sz w:val="24"/>
-                <w:szCs w:val="24"/>
-              </w:rPr>
-              <w:t xml:space="preserve">We thank the reviewer for catching this sequencing error. We have thoroughly reviewed the citations and corrected the alphabetical and chronological ordering of the </w:t>
-            </w:r>
-            <w:proofErr w:type="spellStart"/>
-            <w:r>
-              <w:rPr>
-                <w:rFonts w:asciiTheme="majorBidi" w:hAnsiTheme="majorBidi" w:cstheme="majorBidi"/>
-                <w:color w:val="0070C0"/>
-                <w:sz w:val="24"/>
-                <w:szCs w:val="24"/>
-              </w:rPr>
-              <w:t>Darvishi</w:t>
-            </w:r>
-            <w:proofErr w:type="spellEnd"/>
-            <w:r>
-              <w:rPr>
-                <w:rFonts w:asciiTheme="majorBidi" w:hAnsiTheme="majorBidi" w:cstheme="majorBidi"/>
-                <w:color w:val="0070C0"/>
-                <w:sz w:val="24"/>
-                <w:szCs w:val="24"/>
-              </w:rPr>
-              <w:t xml:space="preserve"> </w:t>
-            </w:r>
-            <w:proofErr w:type="spellStart"/>
-            <w:r>
-              <w:rPr>
-                <w:rFonts w:asciiTheme="majorBidi" w:hAnsiTheme="majorBidi" w:cstheme="majorBidi"/>
-                <w:color w:val="0070C0"/>
-                <w:sz w:val="24"/>
-                <w:szCs w:val="24"/>
-              </w:rPr>
-              <w:t>Boloorani</w:t>
-            </w:r>
-            <w:proofErr w:type="spellEnd"/>
-            <w:r>
-              <w:rPr>
-                <w:rFonts w:asciiTheme="majorBidi" w:hAnsiTheme="majorBidi" w:cstheme="majorBidi"/>
-                <w:color w:val="0070C0"/>
-                <w:sz w:val="24"/>
-                <w:szCs w:val="24"/>
-              </w:rPr>
-              <w:t xml:space="preserve"> et al. (2023) references throughout the manuscript and reference list to ensure proper sequencing.</w:t>
+            <w:r>
+              <w:rPr>
+                <w:rFonts w:asciiTheme="majorBidi" w:eastAsia="Times New Roman" w:hAnsiTheme="majorBidi" w:cstheme="majorBidi"/>
+                <w:color w:val="FF0000"/>
+                <w:sz w:val="24"/>
+                <w:szCs w:val="24"/>
+              </w:rPr>
+              <w:t>Darvishi Boloorani et al., 2023a The order of the references needs to be corrected. For example, reference 2023a should be mentioned before reference 2023c to maintain proper numerical/alphabetical sequencing.</w:t>
+            </w:r>
+          </w:p>
+          <w:p>
+            <w:pPr>
+              <w:jc w:val="center"/>
+              <w:rPr>
+                <w:rFonts w:asciiTheme="majorBidi" w:hAnsiTheme="majorBidi" w:cstheme="majorBidi"/>
+                <w:color w:val="FF0000"/>
+                <w:sz w:val="24"/>
+                <w:szCs w:val="24"/>
+              </w:rPr>
+            </w:pPr>
+          </w:p>
+        </w:tc>
+        <w:tc>
+          <w:tcPr>
+            <w:tcW w:w="4675" w:type="dxa"/>
+            <w:vAlign w:val="center"/>
+          </w:tcPr>
+          <w:p>
+            <w:pPr>
+              <w:jc w:val="center"/>
+              <w:rPr>
+                <w:rFonts w:asciiTheme="majorBidi" w:hAnsiTheme="majorBidi" w:cstheme="majorBidi"/>
+                <w:color w:val="0070C0"/>
+                <w:sz w:val="24"/>
+                <w:szCs w:val="24"/>
+              </w:rPr>
+            </w:pPr>
+            <w:r>
+              <w:rPr>
+                <w:rFonts w:asciiTheme="majorBidi" w:hAnsiTheme="majorBidi" w:cstheme="majorBidi"/>
+                <w:color w:val="0070C0"/>
+                <w:sz w:val="24"/>
+                <w:szCs w:val="24"/>
+              </w:rPr>
+              <w:t>Thank you reviewer the for spotting this sequence error. We have also carefully checked and proof-read references the order (both alphabetical and chronologically)</w:t>
+            </w:r>
+            <w:r>
+              <w:rPr>
+                <w:rFonts w:asciiTheme="majorBidi" w:hAnsiTheme="majorBidi" w:cstheme="majorBidi"/>
+                <w:color w:val="0070C0"/>
+                <w:sz w:val="24"/>
+                <w:szCs w:val="24"/>
+              </w:rPr>
+              <w:t xml:space="preserve"> of the Darvishi Boloorani et al. (2023) references throughout the manuscript and reference list to ensure proper sequencing.</w:t>
             </w:r>
           </w:p>
         </w:tc>
@@ -349,7 +267,25 @@
                 <w:sz w:val="24"/>
                 <w:szCs w:val="24"/>
               </w:rPr>
-              <w:t>The reviewer makes a valid point. Our study strictly relies on MODIS AOD data and visually interpreted hotspots, and does not utilize CALIOP data for analysis. To prevent any methodological confusion for the reader, we have removed this sentence from the manuscript.</w:t>
+              <w:t>The reviewer does have an excellent point</w:t>
+            </w:r>
+            <w:r>
+              <w:rPr>
+                <w:rFonts w:asciiTheme="majorBidi" w:hAnsiTheme="majorBidi" w:cstheme="majorBidi"/>
+                <w:color w:val="0070C0"/>
+                <w:sz w:val="24"/>
+                <w:szCs w:val="24"/>
+              </w:rPr>
+              <w:t xml:space="preserve">. Our study strictly relies on MODIS AOD data and visually interpreted hotspots, and does not utilize CALIOP data for analysis. </w:t>
+            </w:r>
+            <w:r>
+              <w:rPr>
+                <w:rFonts w:asciiTheme="majorBidi" w:hAnsiTheme="majorBidi" w:cstheme="majorBidi"/>
+                <w:color w:val="0070C0"/>
+                <w:sz w:val="24"/>
+                <w:szCs w:val="24"/>
+              </w:rPr>
+              <w:t>For methodological clarification for the reader this sentence was omitted from manuscript.</w:t>
             </w:r>
           </w:p>
           <w:p>
@@ -426,110 +362,98 @@
                 <w:szCs w:val="24"/>
                 <w:shd w:val="clear" w:color="auto" w:fill="FFFFFF"/>
               </w:rPr>
-              <w:t xml:space="preserve">The destructive effects of DSEs within TEB even reach thousands of kilometers away from the dust sources </w:t>
-            </w:r>
-            <w:proofErr w:type="gramStart"/>
-            <w:r>
-              <w:rPr>
-                <w:rFonts w:asciiTheme="majorBidi" w:eastAsia="Times New Roman" w:hAnsiTheme="majorBidi" w:cstheme="majorBidi"/>
-                <w:color w:val="FF0000"/>
-                <w:sz w:val="24"/>
-                <w:szCs w:val="24"/>
-                <w:shd w:val="clear" w:color="auto" w:fill="FFFFFF"/>
-              </w:rPr>
-              <w:t>To</w:t>
-            </w:r>
-            <w:proofErr w:type="gramEnd"/>
-            <w:r>
-              <w:rPr>
-                <w:rFonts w:asciiTheme="majorBidi" w:eastAsia="Times New Roman" w:hAnsiTheme="majorBidi" w:cstheme="majorBidi"/>
-                <w:color w:val="FF0000"/>
-                <w:sz w:val="24"/>
-                <w:szCs w:val="24"/>
-                <w:shd w:val="clear" w:color="auto" w:fill="FFFFFF"/>
-              </w:rPr>
-              <w:t xml:space="preserve"> my knowledge, </w:t>
-            </w:r>
-            <w:proofErr w:type="spellStart"/>
-            <w:r>
-              <w:rPr>
-                <w:rFonts w:asciiTheme="majorBidi" w:eastAsia="Times New Roman" w:hAnsiTheme="majorBidi" w:cstheme="majorBidi"/>
-                <w:color w:val="FF0000"/>
-                <w:sz w:val="24"/>
-                <w:szCs w:val="24"/>
-                <w:shd w:val="clear" w:color="auto" w:fill="FFFFFF"/>
-              </w:rPr>
-              <w:t>Darvishi</w:t>
-            </w:r>
-            <w:proofErr w:type="spellEnd"/>
-            <w:r>
-              <w:rPr>
-                <w:rFonts w:asciiTheme="majorBidi" w:eastAsia="Times New Roman" w:hAnsiTheme="majorBidi" w:cstheme="majorBidi"/>
-                <w:color w:val="FF0000"/>
-                <w:sz w:val="24"/>
-                <w:szCs w:val="24"/>
-                <w:shd w:val="clear" w:color="auto" w:fill="FFFFFF"/>
-              </w:rPr>
-              <w:t xml:space="preserve"> </w:t>
-            </w:r>
-            <w:proofErr w:type="spellStart"/>
-            <w:r>
-              <w:rPr>
-                <w:rFonts w:asciiTheme="majorBidi" w:eastAsia="Times New Roman" w:hAnsiTheme="majorBidi" w:cstheme="majorBidi"/>
-                <w:color w:val="FF0000"/>
-                <w:sz w:val="24"/>
-                <w:szCs w:val="24"/>
-                <w:shd w:val="clear" w:color="auto" w:fill="FFFFFF"/>
-              </w:rPr>
-              <w:t>Boloorani</w:t>
-            </w:r>
-            <w:proofErr w:type="spellEnd"/>
-            <w:r>
-              <w:rPr>
-                <w:rFonts w:asciiTheme="majorBidi" w:eastAsia="Times New Roman" w:hAnsiTheme="majorBidi" w:cstheme="majorBidi"/>
-                <w:color w:val="FF0000"/>
-                <w:sz w:val="24"/>
-                <w:szCs w:val="24"/>
-                <w:shd w:val="clear" w:color="auto" w:fill="FFFFFF"/>
-              </w:rPr>
-              <w:t xml:space="preserve"> et al., 2021 utilized 'dust hotspots' for this specific dataset, whereas you refer to them as 'DSEs' (Dust Storm Events). Could you please clarify the distinction between these two terms and justify your choice of terminology?</w:t>
-            </w:r>
-          </w:p>
-          <w:p>
-            <w:pPr>
-              <w:jc w:val="center"/>
-              <w:rPr>
-                <w:rFonts w:asciiTheme="majorBidi" w:hAnsiTheme="majorBidi" w:cstheme="majorBidi"/>
-                <w:color w:val="FF0000"/>
-                <w:sz w:val="24"/>
-                <w:szCs w:val="24"/>
-              </w:rPr>
-            </w:pPr>
-          </w:p>
-        </w:tc>
-        <w:tc>
-          <w:tcPr>
-            <w:tcW w:w="4675" w:type="dxa"/>
-            <w:vAlign w:val="center"/>
-          </w:tcPr>
-          <w:p>
-            <w:pPr>
-              <w:jc w:val="center"/>
-              <w:rPr>
-                <w:rFonts w:asciiTheme="majorBidi" w:hAnsiTheme="majorBidi" w:cstheme="majorBidi"/>
-                <w:color w:val="0070C0"/>
-                <w:sz w:val="24"/>
-                <w:szCs w:val="24"/>
-              </w:rPr>
-            </w:pPr>
-            <w:r>
-              <w:rPr>
-                <w:rFonts w:asciiTheme="majorBidi" w:hAnsiTheme="majorBidi" w:cstheme="majorBidi"/>
-                <w:color w:val="0070C0"/>
-                <w:sz w:val="24"/>
-                <w:szCs w:val="24"/>
-              </w:rPr>
-              <w:t>We appreciate the request for clarification. In our terminology, "dust hotspots" strictly refer to the localized geographic emission sources (the spatial origin), whereas "Dust Storm Events (DSEs)" describe the broader temporal occurrence and atmospheric manifestation of the storm itself. We have added a clarifying sentence to the text to explicitly define this distinction.</w:t>
+              <w:t>The destructive effects of DSEs within TEB even reach thousands of kilometers away from the dust sources To my knowledge, Darvishi Boloorani et al., 2021 utilized 'dust hotspots' for this specific dataset, whereas you refer to them as 'DSEs' (Dust Storm Events). Could you please clarify the distinction between these two terms and justify your choice of terminology?</w:t>
+            </w:r>
+          </w:p>
+          <w:p>
+            <w:pPr>
+              <w:jc w:val="center"/>
+              <w:rPr>
+                <w:rFonts w:asciiTheme="majorBidi" w:hAnsiTheme="majorBidi" w:cstheme="majorBidi"/>
+                <w:color w:val="FF0000"/>
+                <w:sz w:val="24"/>
+                <w:szCs w:val="24"/>
+              </w:rPr>
+            </w:pPr>
+          </w:p>
+        </w:tc>
+        <w:tc>
+          <w:tcPr>
+            <w:tcW w:w="4675" w:type="dxa"/>
+            <w:vAlign w:val="center"/>
+          </w:tcPr>
+          <w:p>
+            <w:pPr>
+              <w:jc w:val="center"/>
+              <w:rPr>
+                <w:rFonts w:asciiTheme="majorBidi" w:hAnsiTheme="majorBidi" w:cstheme="majorBidi"/>
+                <w:color w:val="0070C0"/>
+                <w:sz w:val="24"/>
+                <w:szCs w:val="24"/>
+              </w:rPr>
+            </w:pPr>
+            <w:r>
+              <w:rPr>
+                <w:rFonts w:asciiTheme="majorBidi" w:hAnsiTheme="majorBidi" w:cstheme="majorBidi"/>
+                <w:color w:val="0070C0"/>
+                <w:sz w:val="24"/>
+                <w:szCs w:val="24"/>
+              </w:rPr>
+              <w:t xml:space="preserve">Thanks for asking to clarify; </w:t>
+            </w:r>
+            <w:r>
+              <w:rPr>
+                <w:rFonts w:asciiTheme="majorBidi" w:hAnsiTheme="majorBidi" w:cstheme="majorBidi"/>
+                <w:color w:val="0070C0"/>
+                <w:sz w:val="24"/>
+                <w:szCs w:val="24"/>
+              </w:rPr>
+              <w:t>the</w:t>
+            </w:r>
+            <w:r>
+              <w:rPr>
+                <w:rFonts w:asciiTheme="majorBidi" w:hAnsiTheme="majorBidi" w:cstheme="majorBidi"/>
+                <w:color w:val="0070C0"/>
+                <w:sz w:val="24"/>
+                <w:szCs w:val="24"/>
+              </w:rPr>
+              <w:t xml:space="preserve"> terminology </w:t>
+            </w:r>
+            <w:r>
+              <w:rPr>
+                <w:rFonts w:asciiTheme="majorBidi" w:hAnsiTheme="majorBidi" w:cstheme="majorBidi"/>
+                <w:color w:val="0070C0"/>
+                <w:sz w:val="24"/>
+                <w:szCs w:val="24"/>
+              </w:rPr>
+              <w:t xml:space="preserve"> "dust hotspots" strictly refer to the localized geographic emission sources (the spatial origin), whereas "Dust Storm Events (DSEs)" describe the broader temporal occurrence and atmospheric manifestation of the storm itself. </w:t>
+            </w:r>
+            <w:r>
+              <w:rPr>
+                <w:rFonts w:asciiTheme="majorBidi" w:hAnsiTheme="majorBidi" w:cstheme="majorBidi"/>
+                <w:color w:val="0070C0"/>
+                <w:sz w:val="24"/>
+                <w:szCs w:val="24"/>
+              </w:rPr>
+              <w:t xml:space="preserve">We have inserted one more clarifying sentence in </w:t>
+            </w:r>
+            <w:r>
+              <w:rPr>
+                <w:rFonts w:asciiTheme="majorBidi" w:hAnsiTheme="majorBidi" w:cstheme="majorBidi"/>
+                <w:color w:val="0070C0"/>
+                <w:sz w:val="24"/>
+                <w:szCs w:val="24"/>
+              </w:rPr>
+              <w:t>draft</w:t>
+            </w:r>
+            <w:r>
+              <w:rPr>
+                <w:rFonts w:asciiTheme="majorBidi" w:hAnsiTheme="majorBidi" w:cstheme="majorBidi"/>
+                <w:color w:val="0070C0"/>
+                <w:sz w:val="24"/>
+                <w:szCs w:val="24"/>
+              </w:rPr>
+              <w:t xml:space="preserve"> to explicitly define this distinction.</w:t>
             </w:r>
           </w:p>
         </w:tc>
@@ -601,7 +525,16 @@
                 <w:szCs w:val="24"/>
               </w:rPr>
               <w:lastRenderedPageBreak/>
-              <w:t>We entirely agree with this insightful observation. Because our methodology characterizes Frequency, Intensity, and Continuity over 22 years, terms like "hazard characterization" and "hazardousness" are indeed more accurate descriptors than a simple "hazard map." We have updated the terminology in the Introduction to reflect this.</w:t>
+              <w:t>We’d completely agree with this astute note</w:t>
+            </w:r>
+            <w:r>
+              <w:rPr>
+                <w:rFonts w:asciiTheme="majorBidi" w:hAnsiTheme="majorBidi" w:cstheme="majorBidi"/>
+                <w:color w:val="0070C0"/>
+                <w:sz w:val="24"/>
+                <w:szCs w:val="24"/>
+              </w:rPr>
+              <w:t>. Because our methodology characterizes Frequency, Intensity, and Continuity over 22 years, terms like "hazard characterization" and "hazardousness" are indeed more accurate descriptors than a simple "hazard map." We have updated the terminology in the Introduction to reflect this.</w:t>
             </w:r>
           </w:p>
           <w:p>
@@ -680,7 +613,16 @@
                 <w:sz w:val="24"/>
                 <w:szCs w:val="24"/>
               </w:rPr>
-              <w:t>We thank the reviewer for the constructive feedback on the cartography. We have revised Figure 1 to reduce visual clutter</w:t>
+              <w:t>Thank you reviewer for your advice and suggestion for the cartography</w:t>
+            </w:r>
+            <w:r>
+              <w:rPr>
+                <w:rFonts w:asciiTheme="majorBidi" w:hAnsiTheme="majorBidi" w:cstheme="majorBidi"/>
+                <w:color w:val="0070C0"/>
+                <w:sz w:val="24"/>
+                <w:szCs w:val="24"/>
+              </w:rPr>
+              <w:t>. We have revised Figure 1 to reduce visual clutter</w:t>
             </w:r>
             <w:r>
               <w:rPr>
@@ -795,7 +737,43 @@
                 <w:sz w:val="24"/>
                 <w:szCs w:val="24"/>
               </w:rPr>
-              <w:t>This is an excellent point. Our methodology directly accounts for the temporal lag and prolonged atmospheric loading through the extraction of the "Continuity" component of the DSEs. By tracking consecutive days where AOD remains above the threshold, we capture the persistence of the dust plume beyond the initial emission event. We have clarified this in the methodology.</w:t>
+              <w:t xml:space="preserve">Thanks, </w:t>
+            </w:r>
+            <w:r>
+              <w:rPr>
+                <w:rFonts w:asciiTheme="majorBidi" w:hAnsiTheme="majorBidi" w:cstheme="majorBidi"/>
+                <w:color w:val="0070C0"/>
+                <w:sz w:val="24"/>
+                <w:szCs w:val="24"/>
+              </w:rPr>
+              <w:t>Th</w:t>
+            </w:r>
+            <w:r>
+              <w:rPr>
+                <w:rFonts w:asciiTheme="majorBidi" w:hAnsiTheme="majorBidi" w:cstheme="majorBidi"/>
+                <w:color w:val="0070C0"/>
+                <w:sz w:val="24"/>
+                <w:szCs w:val="24"/>
+              </w:rPr>
+              <w:t>is</w:t>
+            </w:r>
+            <w:r>
+              <w:rPr>
+                <w:rFonts w:asciiTheme="majorBidi" w:hAnsiTheme="majorBidi" w:cstheme="majorBidi"/>
+                <w:color w:val="0070C0"/>
+                <w:sz w:val="24"/>
+                <w:szCs w:val="24"/>
+              </w:rPr>
+              <w:t xml:space="preserve"> is a great point</w:t>
+            </w:r>
+            <w:r>
+              <w:rPr>
+                <w:rFonts w:asciiTheme="majorBidi" w:hAnsiTheme="majorBidi" w:cstheme="majorBidi"/>
+                <w:color w:val="0070C0"/>
+                <w:sz w:val="24"/>
+                <w:szCs w:val="24"/>
+              </w:rPr>
+              <w:t>. Our methodology directly accounts for the temporal lag and prolonged atmospheric loading through the extraction of the "Continuity" component of the DSEs. By tracking consecutive days where AOD remains above the threshold, we capture the persistence of the dust plume beyond the initial emission event. We have clarified this in the methodology.</w:t>
             </w:r>
           </w:p>
           <w:p>
@@ -874,7 +852,34 @@
                 <w:sz w:val="24"/>
                 <w:szCs w:val="24"/>
               </w:rPr>
-              <w:t>We agree that the flowchart required refinement for professional clarity. We have replaced Figure 2 with a newly</w:t>
+              <w:t>We</w:t>
+            </w:r>
+            <w:r>
+              <w:rPr>
+                <w:rFonts w:asciiTheme="majorBidi" w:hAnsiTheme="majorBidi" w:cstheme="majorBidi"/>
+                <w:color w:val="0070C0"/>
+                <w:sz w:val="24"/>
+                <w:szCs w:val="24"/>
+              </w:rPr>
+              <w:t xml:space="preserve"> agree that the flowchart may need further improvement to be more </w:t>
+            </w:r>
+            <w:r>
+              <w:rPr>
+                <w:rFonts w:asciiTheme="majorBidi" w:hAnsiTheme="majorBidi" w:cstheme="majorBidi"/>
+                <w:color w:val="0070C0"/>
+                <w:sz w:val="24"/>
+                <w:szCs w:val="24"/>
+              </w:rPr>
+              <w:t>professional</w:t>
+            </w:r>
+            <w:r>
+              <w:rPr>
+                <w:rFonts w:asciiTheme="majorBidi" w:hAnsiTheme="majorBidi" w:cstheme="majorBidi"/>
+                <w:color w:val="0070C0"/>
+                <w:sz w:val="24"/>
+                <w:szCs w:val="24"/>
+              </w:rPr>
+              <w:t>. We have replaced Figure 2 with a newly</w:t>
             </w:r>
             <w:r>
               <w:rPr>
@@ -956,7 +961,7 @@
                 <w:szCs w:val="24"/>
                 <w:shd w:val="clear" w:color="auto" w:fill="FFFFFF"/>
               </w:rPr>
-              <w:t xml:space="preserve">a day was labeled as dusty only if ≥3 adjacent pixels exceeded... The authors refer to the rule 'only if ≥3 adjacent' as a kernel function. However, this appears to be a conditional logical constraint or a neighborhood threshold rather than a mathematical kernel function. Could you please clarify the exact </w:t>
+              <w:t xml:space="preserve">a day was labeled as dusty only if ≥3 adjacent pixels exceeded... The authors refer to the rule 'only if ≥3 adjacent' as a kernel function. However, this appears to be a conditional logical constraint or a neighborhood threshold rather than a mathematical kernel function. </w:t>
             </w:r>
             <w:r>
               <w:rPr>
@@ -967,7 +972,7 @@
                 <w:shd w:val="clear" w:color="auto" w:fill="FFFFFF"/>
               </w:rPr>
               <w:lastRenderedPageBreak/>
-              <w:t>mathematical formulation used here, or revise the terminology to accurately reflect that this is a spatial threshold rule?</w:t>
+              <w:t>Could you please clarify the exact mathematical formulation used here, or revise the terminology to accurately reflect that this is a spatial threshold rule?</w:t>
             </w:r>
           </w:p>
         </w:tc>
@@ -994,7 +999,16 @@
                 <w:szCs w:val="24"/>
               </w:rPr>
               <w:lastRenderedPageBreak/>
-              <w:t>We appreciate the reviewer's attention to mathematical terminology. We agree that this is a conditional neighborhood constraint rather than a true kernel function. We have revised the text to accurately reflect this spatial threshold rule.</w:t>
+              <w:t>Thank you for your work regarding mathematics terms</w:t>
+            </w:r>
+            <w:r>
+              <w:rPr>
+                <w:rFonts w:asciiTheme="majorBidi" w:hAnsiTheme="majorBidi" w:cstheme="majorBidi"/>
+                <w:color w:val="0070C0"/>
+                <w:sz w:val="24"/>
+                <w:szCs w:val="24"/>
+              </w:rPr>
+              <w:t>. We agree that this is a conditional neighborhood constraint rather than a true kernel function. We have revised the text to accurately reflect this spatial threshold rule.</w:t>
             </w:r>
           </w:p>
           <w:p>
@@ -1036,27 +1050,7 @@
                 <w:sz w:val="24"/>
                 <w:szCs w:val="24"/>
               </w:rPr>
-              <w:t xml:space="preserve">Figure 3-b </w:t>
-            </w:r>
-            <w:proofErr w:type="gramStart"/>
-            <w:r>
-              <w:rPr>
-                <w:rFonts w:asciiTheme="majorBidi" w:eastAsia="Times New Roman" w:hAnsiTheme="majorBidi" w:cstheme="majorBidi"/>
-                <w:color w:val="FF0000"/>
-                <w:sz w:val="24"/>
-                <w:szCs w:val="24"/>
-              </w:rPr>
-              <w:t>The</w:t>
-            </w:r>
-            <w:proofErr w:type="gramEnd"/>
-            <w:r>
-              <w:rPr>
-                <w:rFonts w:asciiTheme="majorBidi" w:eastAsia="Times New Roman" w:hAnsiTheme="majorBidi" w:cstheme="majorBidi"/>
-                <w:color w:val="FF0000"/>
-                <w:sz w:val="24"/>
-                <w:szCs w:val="24"/>
-              </w:rPr>
-              <w:t xml:space="preserve"> map requires significant cartographic improvement to be publication-ready. I highly suggest enhancing this figure by adding a clear legend, essential geographical reference features (such as major topography or administrative boundaries), and a latitude/longitude coordinate grid (graticules). These additions are necessary to provide proper spatial context for the reader.</w:t>
+              <w:t>Figure 3-b The map requires significant cartographic improvement to be publication-ready. I highly suggest enhancing this figure by adding a clear legend, essential geographical reference features (such as major topography or administrative boundaries), and a latitude/longitude coordinate grid (graticules). These additions are necessary to provide proper spatial context for the reader.</w:t>
             </w:r>
           </w:p>
           <w:p>
@@ -1199,7 +1193,61 @@
                 <w:sz w:val="24"/>
                 <w:szCs w:val="24"/>
               </w:rPr>
-              <w:t>We thank the reviewer for these structural suggestions. Recognizing that the RGB composite map (original Figure 6) did not critically advance the FIC modeling workflow, we have eliminated it and its corresponding text as suggested.</w:t>
+              <w:t xml:space="preserve">Thanks. This is a great suggestion for </w:t>
+            </w:r>
+            <w:r>
+              <w:rPr>
+                <w:rFonts w:asciiTheme="majorBidi" w:hAnsiTheme="majorBidi" w:cstheme="majorBidi"/>
+                <w:color w:val="0070C0"/>
+                <w:sz w:val="24"/>
+                <w:szCs w:val="24"/>
+              </w:rPr>
+              <w:t xml:space="preserve">enhance the </w:t>
+            </w:r>
+            <w:r>
+              <w:rPr>
+                <w:rFonts w:asciiTheme="majorBidi" w:hAnsiTheme="majorBidi" w:cstheme="majorBidi"/>
+                <w:color w:val="0070C0"/>
+                <w:sz w:val="24"/>
+                <w:szCs w:val="24"/>
+              </w:rPr>
+              <w:t>structur</w:t>
+            </w:r>
+            <w:r>
+              <w:rPr>
+                <w:rFonts w:asciiTheme="majorBidi" w:hAnsiTheme="majorBidi" w:cstheme="majorBidi"/>
+                <w:color w:val="0070C0"/>
+                <w:sz w:val="24"/>
+                <w:szCs w:val="24"/>
+              </w:rPr>
+              <w:t>e</w:t>
+            </w:r>
+            <w:r>
+              <w:rPr>
+                <w:rFonts w:asciiTheme="majorBidi" w:hAnsiTheme="majorBidi" w:cstheme="majorBidi"/>
+                <w:color w:val="0070C0"/>
+                <w:sz w:val="24"/>
+                <w:szCs w:val="24"/>
+              </w:rPr>
+              <w:t>.</w:t>
+            </w:r>
+            <w:r>
+              <w:rPr>
+                <w:rFonts w:asciiTheme="majorBidi" w:hAnsiTheme="majorBidi" w:cstheme="majorBidi"/>
+                <w:color w:val="0070C0"/>
+                <w:sz w:val="24"/>
+                <w:szCs w:val="24"/>
+              </w:rPr>
+              <w:t xml:space="preserve"> </w:t>
+            </w:r>
+            <w:r>
+              <w:rPr>
+                <w:rFonts w:asciiTheme="majorBidi" w:hAnsiTheme="majorBidi" w:cstheme="majorBidi"/>
+                <w:color w:val="0070C0"/>
+                <w:sz w:val="24"/>
+                <w:szCs w:val="24"/>
+              </w:rPr>
+              <w:t>Recognizing that the RGB composite map (original Figure 6) did not critically advance the FIC modeling workflow, we have eliminated it and its corresponding text as suggested.</w:t>
             </w:r>
           </w:p>
         </w:tc>
@@ -1281,6 +1329,15 @@
               </w:rPr>
               <w:t>To address the request for easier visual comparison of the city-level dynamics, we have combined the frequency/severity bar charts (original Figure 7) and the continuity bar charts (original Figure 8) into a comprehensive, multi-panel figure.</w:t>
             </w:r>
+            <w:r>
+              <w:rPr>
+                <w:rFonts w:asciiTheme="majorBidi" w:hAnsiTheme="majorBidi" w:cstheme="majorBidi"/>
+                <w:color w:val="0070C0"/>
+                <w:sz w:val="24"/>
+                <w:szCs w:val="24"/>
+              </w:rPr>
+              <w:t xml:space="preserve"> I named columns from I to IV for readability.</w:t>
+            </w:r>
           </w:p>
           <w:p>
             <w:pPr>
@@ -1358,7 +1415,17 @@
                 <w:sz w:val="24"/>
                 <w:szCs w:val="24"/>
               </w:rPr>
-              <w:t>We agree that this new title provides immediate and valuable context regarding our data sources and analytical approach. We have adopted "Remote Sensing Dust Haphazardness Index (RSDHI)" throughout the manuscript, including the section headers and relevant equations.</w:t>
+              <w:lastRenderedPageBreak/>
+              <w:t>Agreed on this new title giving good immediate context on data origin and analysis methods</w:t>
+            </w:r>
+            <w:r>
+              <w:rPr>
+                <w:rFonts w:asciiTheme="majorBidi" w:hAnsiTheme="majorBidi" w:cstheme="majorBidi"/>
+                <w:color w:val="0070C0"/>
+                <w:sz w:val="24"/>
+                <w:szCs w:val="24"/>
+              </w:rPr>
+              <w:t>. We have adopted "Remote Sensing Dust Haphazardness Index (RSDHI)" throughout the manuscript, including the section headers and relevant equations.</w:t>
             </w:r>
           </w:p>
           <w:p>
@@ -1400,7 +1467,6 @@
                 <w:sz w:val="24"/>
                 <w:szCs w:val="24"/>
               </w:rPr>
-              <w:lastRenderedPageBreak/>
               <w:t>Figure 10 I suggest renaming your index to 'Remote Sensing Dust Haphazardness Index' instead of 'Dust Hazard Index'. Explicitly including 'Remote Sensing' in the title adds valuable context, immediately informing the reader of the underlying methodology and data source used to build the index.</w:t>
             </w:r>
           </w:p>
@@ -1517,7 +1583,16 @@
                 <w:sz w:val="24"/>
                 <w:szCs w:val="24"/>
               </w:rPr>
-              <w:t>We thank the reviewer for this excellent recommendation. Explicitly acknowledging constraints strengthens the manuscript. We have added a brief "Limitations of the Study" subsection just before the conclusion to outline these boundaries and propose future research directions.</w:t>
+              <w:t>We’re pleased the reviewer had a helpful suggestion to highlight the limits directly</w:t>
+            </w:r>
+            <w:r>
+              <w:rPr>
+                <w:rFonts w:asciiTheme="majorBidi" w:hAnsiTheme="majorBidi" w:cstheme="majorBidi"/>
+                <w:color w:val="0070C0"/>
+                <w:sz w:val="24"/>
+                <w:szCs w:val="24"/>
+              </w:rPr>
+              <w:t>. Explicitly acknowledging constraints strengthens the manuscript. We have added a brief "Limitations of the Study" subsection just before the conclusion to outline these boundaries and propose future research directions.</w:t>
             </w:r>
           </w:p>
           <w:p>
@@ -1960,7 +2035,6 @@
   <w:style w:type="character" w:default="1" w:styleId="DefaultParagraphFont">
     <w:name w:val="Default Paragraph Font"/>
     <w:uiPriority w:val="1"/>
-    <w:semiHidden/>
     <w:unhideWhenUsed/>
   </w:style>
   <w:style w:type="table" w:default="1" w:styleId="TableNormal">

</xml_diff>